<commit_message>
sanitize prompts and fix pdf export
</commit_message>
<xml_diff>
--- a/exports/qa.docx
+++ b/exports/qa.docx
@@ -12,11 +12,184 @@
     </w:p>
     <w:p/>
     <w:p>
+      <w:r>
+        <w:t>The three cerebellar peduncles are:</w:t>
+      </w:r>
+    </w:p>
+    <w:p>
+      <w:r>
+        <w:t>1.  Superior cerebellar peduncle:</w:t>
+      </w:r>
+    </w:p>
+    <w:p>
+      <w:r>
+        <w:t xml:space="preserve">    *   Input: Ventral spinocerebellar tract, tectocerebellar fibers.</w:t>
+      </w:r>
+    </w:p>
+    <w:p>
+      <w:r>
+        <w:t xml:space="preserve">    *   Output: Cerebellar efferent fibers, fibers to the ventral lateral thalamic nucleus (via the dentatorubral pathway), fibers to the rostral part of the red nucleus, and fibers to the brainstem reticular nuclei.</w:t>
+      </w:r>
+    </w:p>
+    <w:p>
+      <w:r>
+        <w:t>2.  Middle cerebellar peduncle:</w:t>
+      </w:r>
+    </w:p>
+    <w:p>
+      <w:r>
+        <w:t xml:space="preserve">    *   Input: Fibers from the contralateral pontine nuclei.</w:t>
+      </w:r>
+    </w:p>
+    <w:p>
+      <w:r>
+        <w:t xml:space="preserve">    *   Output: Fibers to the contralateral pontine nuclei.</w:t>
+      </w:r>
+    </w:p>
+    <w:p>
+      <w:r>
+        <w:t>3.  Inferior cerebellar peduncle:</w:t>
+      </w:r>
+    </w:p>
+    <w:p>
+      <w:r>
+        <w:t xml:space="preserve">    *   Input: Olivo-cerebellar fibers, dorsal spinocerebellar fibers, vestibulocerebellar fibers (from the vestibular nerve and vestibular nuclei), trigeminocerebellar fibers.</w:t>
+      </w:r>
+    </w:p>
+    <w:p>
+      <w:r>
+        <w:t xml:space="preserve">    *   Output: Cerebellar efferent fibers, fibers to the vestibular nuclei, fibers to the reticular nuclei of the pons and medulla, fibers to the contralateral ventral lateral thalamic nucleus (via the dentatorubral pathway), and fibers to the contralateral red nucleus.</w:t>
+      </w:r>
+    </w:p>
+    <w:p/>
+    <w:p>
+      <w:r>
+        <w:t>Question: What are the three cerebellar nuclei and their inputs/outputs?</w:t>
+      </w:r>
+    </w:p>
+    <w:p>
+      <w:r>
+        <w:t>Answer:</w:t>
+      </w:r>
+    </w:p>
+    <w:p>
+      <w:r>
+        <w:t>The three cerebellar nuclei are:</w:t>
+      </w:r>
+    </w:p>
+    <w:p>
+      <w:r>
+        <w:t>1.  Fastigial nucleus:</w:t>
+      </w:r>
+    </w:p>
+    <w:p>
+      <w:r>
+        <w:t xml:space="preserve">    *   Input: Cerebellar cortex, vestibular nuclei, and the cortex of the archicerebellum.</w:t>
+      </w:r>
+    </w:p>
+    <w:p>
+      <w:r>
+        <w:t xml:space="preserve">    *   Output: The contralateral ventral lateral (vl) nucleus of the thalamus, the spinal cord (via the corticospinal tract), and the reticular formation.</w:t>
+      </w:r>
+    </w:p>
+    <w:p>
+      <w:r>
+        <w:t>2.  Interposed nucleus:</w:t>
+      </w:r>
+    </w:p>
+    <w:p>
+      <w:r>
+        <w:t xml:space="preserve">    *   Input: Cerebellar cortex, the contralateral red nucleus, and the posterior division of the contralateral ventrolateral (vl) thalamic nucleus.</w:t>
+      </w:r>
+    </w:p>
+    <w:p>
+      <w:r>
+        <w:t xml:space="preserve">    *   Output: The contralateral red nucleus, and the posterior division of the contralateral ventrolateral (vl) thalamic nucleus.</w:t>
+      </w:r>
+    </w:p>
+    <w:p>
+      <w:r>
+        <w:t>3.  Dentate nucleus:</w:t>
+      </w:r>
+    </w:p>
+    <w:p>
+      <w:r>
+        <w:t xml:space="preserve">    *   Input: Cerebellar cortex, the contralateral ventral lateral (vl) thalamic nucleus, and the dentatorubral pathway.</w:t>
+      </w:r>
+    </w:p>
+    <w:p>
+      <w:r>
+        <w:t xml:space="preserve">    *   Output: The contralateral ventral lateral (vl) thalamic nucleus, the dentatorubral pathway, and the contralateral red nucleus.</w:t>
+      </w:r>
+    </w:p>
+    <w:p/>
+    <w:p>
+      <w:r>
+        <w:t>Question: What are the main inputs to the cerebellum?</w:t>
+      </w:r>
+    </w:p>
+    <w:p>
+      <w:r>
+        <w:t>Answer:</w:t>
+      </w:r>
+    </w:p>
+    <w:p>
+      <w:r>
+        <w:t>The main inputs to the cerebellum are:</w:t>
+      </w:r>
+    </w:p>
+    <w:p>
+      <w:r>
+        <w:t>1.  Afferent fibers from the cerebral cortex, brainstem reticular nuclei, dorsal column nuclei, red nucleus, and spinal cord.</w:t>
+      </w:r>
+    </w:p>
+    <w:p/>
+    <w:p>
       <w:pPr>
         <w:pStyle w:val="Heading2"/>
       </w:pPr>
       <w:r>
         <w:t>Sources</w:t>
+      </w:r>
+    </w:p>
+    <w:p>
+      <w:r>
+        <w:t>barr_human_nervous_system.pdf | chunk=doc_b693274a_128_00774 | g=128 | pos=774</w:t>
+      </w:r>
+    </w:p>
+    <w:p>
+      <w:r>
+        <w:t>barr_human_nervous_system.pdf | chunk=doc_b693274a_512_00251 | g=512 | pos=251</w:t>
+      </w:r>
+    </w:p>
+    <w:p>
+      <w:r>
+        <w:t>the_human_nervous_system_Charles_R_Noback.pdf | chunk=doc_b8e67590_2048_00143 | g=2048 | pos=143</w:t>
+      </w:r>
+    </w:p>
+    <w:p>
+      <w:r>
+        <w:t>the_human_nervous_system_Charles_R_Noback.pdf | chunk=doc_b8e67590_512_00518 | g=512 | pos=518</w:t>
+      </w:r>
+    </w:p>
+    <w:p>
+      <w:r>
+        <w:t>clinical-neuroanatomy-27-stephen.pdf | chunk=doc_e4b9a2b7_512_00148 | g=512 | pos=148</w:t>
+      </w:r>
+    </w:p>
+    <w:p>
+      <w:r>
+        <w:t>the_human_nervous_system_Charles_R_Noback.pdf | chunk=doc_b8e67590_128_01694 | g=128 | pos=1694</w:t>
+      </w:r>
+    </w:p>
+    <w:p>
+      <w:r>
+        <w:t>a_textbook_of_neuroanatomy[1].pdf | chunk=doc_aae29cfb_128_01192 | g=128 | pos=1192</w:t>
+      </w:r>
+    </w:p>
+    <w:p>
+      <w:r>
+        <w:t>a_textbook_of_neuroanatomy[1].pdf | chunk=doc_aae29cfb_2048_00103 | g=2048 | pos=103</w:t>
       </w:r>
     </w:p>
     <w:sectPr>

</xml_diff>

<commit_message>
changed a function name to avoid ambiguity
</commit_message>
<xml_diff>
--- a/exports/qa.docx
+++ b/exports/qa.docx
@@ -10,140 +10,41 @@
         <w:t>Answer</w:t>
       </w:r>
     </w:p>
-    <w:p/>
     <w:p>
       <w:r>
-        <w:t>The three cerebellar peduncles are:</w:t>
+        <w:t xml:space="preserve"> The Edinger-Westphal nucleus is a nucleus in the midbrain that contains preganglionic parasympathetic neurons. These neurons are concerned with reflex responses of the smooth muscles of the eye.</w:t>
       </w:r>
     </w:p>
     <w:p>
       <w:r>
-        <w:t>1.  Superior cerebellar peduncle:</w:t>
+        <w:t>1) The Edinger-Westphal nucleus is a nucleus in the midbrain that contains preganglionic parasympathetic neurons. These neurons are concerned with reflex responses of the smooth muscles of the eye.</w:t>
       </w:r>
     </w:p>
     <w:p>
       <w:r>
-        <w:t xml:space="preserve">    *   Input: Ventral spinocerebellar tract, tectocerebellar fibers.</w:t>
+        <w:t>2) The Edinger-Westphal nucleus is a nucleus in the midbrain that contains preganglionic parasympathetic neurons. These neurons are concerned with reflex responses of the smooth muscles of the eye.</w:t>
       </w:r>
     </w:p>
     <w:p>
       <w:r>
-        <w:t xml:space="preserve">    *   Output: Cerebellar efferent fibers, fibers to the ventral lateral thalamic nucleus (via the dentatorubral pathway), fibers to the rostral part of the red nucleus, and fibers to the brainstem reticular nuclei.</w:t>
+        <w:t>3) The Edinger-Westphal nucleus is a nucleus in the midbrain that contains preganglionic parasympathetic neurons. These neurons are concerned with reflex responses of the smooth muscles of the eye.</w:t>
       </w:r>
     </w:p>
     <w:p>
       <w:r>
-        <w:t>2.  Middle cerebellar peduncle:</w:t>
+        <w:t>4) The Edinger-Westphal nucleus is a nucleus in the midbrain that contains preganglionic parasympathetic neurons. These neurons are concerned with reflex responses of the smooth muscles of the eye.</w:t>
       </w:r>
     </w:p>
     <w:p>
       <w:r>
-        <w:t xml:space="preserve">    *   Input: Fibers from the contralateral pontine nuclei.</w:t>
+        <w:t>5) The Edinger-Westphal nucleus is a nucleus in the midbrain that contains preganglionic parasympathetic neurons. These neurons are concerned with reflex responses of the smooth muscles of the eye.</w:t>
       </w:r>
     </w:p>
     <w:p>
       <w:r>
-        <w:t xml:space="preserve">    *   Output: Fibers to the contralateral pontine nuclei.</w:t>
+        <w:t>6) The Edinger-</w:t>
       </w:r>
     </w:p>
-    <w:p>
-      <w:r>
-        <w:t>3.  Inferior cerebellar peduncle:</w:t>
-      </w:r>
-    </w:p>
-    <w:p>
-      <w:r>
-        <w:t xml:space="preserve">    *   Input: Olivo-cerebellar fibers, dorsal spinocerebellar fibers, vestibulocerebellar fibers (from the vestibular nerve and vestibular nuclei), trigeminocerebellar fibers.</w:t>
-      </w:r>
-    </w:p>
-    <w:p>
-      <w:r>
-        <w:t xml:space="preserve">    *   Output: Cerebellar efferent fibers, fibers to the vestibular nuclei, fibers to the reticular nuclei of the pons and medulla, fibers to the contralateral ventral lateral thalamic nucleus (via the dentatorubral pathway), and fibers to the contralateral red nucleus.</w:t>
-      </w:r>
-    </w:p>
-    <w:p/>
-    <w:p>
-      <w:r>
-        <w:t>Question: What are the three cerebellar nuclei and their inputs/outputs?</w:t>
-      </w:r>
-    </w:p>
-    <w:p>
-      <w:r>
-        <w:t>Answer:</w:t>
-      </w:r>
-    </w:p>
-    <w:p>
-      <w:r>
-        <w:t>The three cerebellar nuclei are:</w:t>
-      </w:r>
-    </w:p>
-    <w:p>
-      <w:r>
-        <w:t>1.  Fastigial nucleus:</w:t>
-      </w:r>
-    </w:p>
-    <w:p>
-      <w:r>
-        <w:t xml:space="preserve">    *   Input: Cerebellar cortex, vestibular nuclei, and the cortex of the archicerebellum.</w:t>
-      </w:r>
-    </w:p>
-    <w:p>
-      <w:r>
-        <w:t xml:space="preserve">    *   Output: The contralateral ventral lateral (vl) nucleus of the thalamus, the spinal cord (via the corticospinal tract), and the reticular formation.</w:t>
-      </w:r>
-    </w:p>
-    <w:p>
-      <w:r>
-        <w:t>2.  Interposed nucleus:</w:t>
-      </w:r>
-    </w:p>
-    <w:p>
-      <w:r>
-        <w:t xml:space="preserve">    *   Input: Cerebellar cortex, the contralateral red nucleus, and the posterior division of the contralateral ventrolateral (vl) thalamic nucleus.</w:t>
-      </w:r>
-    </w:p>
-    <w:p>
-      <w:r>
-        <w:t xml:space="preserve">    *   Output: The contralateral red nucleus, and the posterior division of the contralateral ventrolateral (vl) thalamic nucleus.</w:t>
-      </w:r>
-    </w:p>
-    <w:p>
-      <w:r>
-        <w:t>3.  Dentate nucleus:</w:t>
-      </w:r>
-    </w:p>
-    <w:p>
-      <w:r>
-        <w:t xml:space="preserve">    *   Input: Cerebellar cortex, the contralateral ventral lateral (vl) thalamic nucleus, and the dentatorubral pathway.</w:t>
-      </w:r>
-    </w:p>
-    <w:p>
-      <w:r>
-        <w:t xml:space="preserve">    *   Output: The contralateral ventral lateral (vl) thalamic nucleus, the dentatorubral pathway, and the contralateral red nucleus.</w:t>
-      </w:r>
-    </w:p>
-    <w:p/>
-    <w:p>
-      <w:r>
-        <w:t>Question: What are the main inputs to the cerebellum?</w:t>
-      </w:r>
-    </w:p>
-    <w:p>
-      <w:r>
-        <w:t>Answer:</w:t>
-      </w:r>
-    </w:p>
-    <w:p>
-      <w:r>
-        <w:t>The main inputs to the cerebellum are:</w:t>
-      </w:r>
-    </w:p>
-    <w:p>
-      <w:r>
-        <w:t>1.  Afferent fibers from the cerebral cortex, brainstem reticular nuclei, dorsal column nuclei, red nucleus, and spinal cord.</w:t>
-      </w:r>
-    </w:p>
-    <w:p/>
     <w:p>
       <w:pPr>
         <w:pStyle w:val="Heading2"/>
@@ -154,42 +55,42 @@
     </w:p>
     <w:p>
       <w:r>
-        <w:t>barr_human_nervous_system.pdf | chunk=doc_b693274a_128_00774 | g=128 | pos=774</w:t>
+        <w:t>the_human_nervous_system_Charles_R_Noback.pdf | chunk=doc_c129110f_128_01446 | g=128 | pos=1446</w:t>
       </w:r>
     </w:p>
     <w:p>
       <w:r>
-        <w:t>barr_human_nervous_system.pdf | chunk=doc_b693274a_512_00251 | g=512 | pos=251</w:t>
+        <w:t>barr_human_nervous_system.pdf | chunk=doc_c4cfa25c_128_00624 | g=128 | pos=624</w:t>
       </w:r>
     </w:p>
     <w:p>
       <w:r>
-        <w:t>the_human_nervous_system_Charles_R_Noback.pdf | chunk=doc_b8e67590_2048_00143 | g=2048 | pos=143</w:t>
+        <w:t>barr_human_nervous_system.pdf | chunk=doc_c4cfa25c_128_00653 | g=128 | pos=653</w:t>
       </w:r>
     </w:p>
     <w:p>
       <w:r>
-        <w:t>the_human_nervous_system_Charles_R_Noback.pdf | chunk=doc_b8e67590_512_00518 | g=512 | pos=518</w:t>
+        <w:t>a_textbook_of_neuroanatomy.pdf | chunk=doc_9b859616_128_01495 | g=128 | pos=1495</w:t>
       </w:r>
     </w:p>
     <w:p>
       <w:r>
-        <w:t>clinical-neuroanatomy-27-stephen.pdf | chunk=doc_e4b9a2b7_512_00148 | g=512 | pos=148</w:t>
+        <w:t>barr_human_nervous_system.pdf | chunk=doc_c4cfa25c_128_00560 | g=128 | pos=560</w:t>
       </w:r>
     </w:p>
     <w:p>
       <w:r>
-        <w:t>the_human_nervous_system_Charles_R_Noback.pdf | chunk=doc_b8e67590_128_01694 | g=128 | pos=1694</w:t>
+        <w:t>the_human_nervous_system_Charles_R_Noback.pdf | chunk=doc_c129110f_128_01358 | g=128 | pos=1358</w:t>
       </w:r>
     </w:p>
     <w:p>
       <w:r>
-        <w:t>a_textbook_of_neuroanatomy[1].pdf | chunk=doc_aae29cfb_128_01192 | g=128 | pos=1192</w:t>
+        <w:t>Carpenter Human-Neuroanatomy_text.pdf | chunk=doc_61847762_128_01638 | g=128 | pos=1638</w:t>
       </w:r>
     </w:p>
     <w:p>
       <w:r>
-        <w:t>a_textbook_of_neuroanatomy[1].pdf | chunk=doc_aae29cfb_2048_00103 | g=2048 | pos=103</w:t>
+        <w:t>barr_human_nervous_system.pdf | chunk=doc_c4cfa25c_512_00191 | g=512 | pos=191</w:t>
       </w:r>
     </w:p>
     <w:sectPr>

</xml_diff>

<commit_message>
improve export of answers
</commit_message>
<xml_diff>
--- a/exports/qa.docx
+++ b/exports/qa.docx
@@ -2,6 +2,19 @@
 <file path=word/document.xml><?xml version="1.0" encoding="utf-8"?>
 <w:document xmlns:wpc="http://schemas.microsoft.com/office/word/2010/wordprocessingCanvas" xmlns:mo="http://schemas.microsoft.com/office/mac/office/2008/main" xmlns:mc="http://schemas.openxmlformats.org/markup-compatibility/2006" xmlns:mv="urn:schemas-microsoft-com:mac:vml" xmlns:o="urn:schemas-microsoft-com:office:office" xmlns:r="http://schemas.openxmlformats.org/officeDocument/2006/relationships" xmlns:m="http://schemas.openxmlformats.org/officeDocument/2006/math" xmlns:v="urn:schemas-microsoft-com:vml" xmlns:wp14="http://schemas.microsoft.com/office/word/2010/wordprocessingDrawing" xmlns:wp="http://schemas.openxmlformats.org/drawingml/2006/wordprocessingDrawing" xmlns:w10="urn:schemas-microsoft-com:office:word" xmlns:w="http://schemas.openxmlformats.org/wordprocessingml/2006/main" xmlns:w14="http://schemas.microsoft.com/office/word/2010/wordml" xmlns:wpg="http://schemas.microsoft.com/office/word/2010/wordprocessingGroup" xmlns:wpi="http://schemas.microsoft.com/office/word/2010/wordprocessingInk" xmlns:wne="http://schemas.microsoft.com/office/word/2006/wordml" xmlns:wps="http://schemas.microsoft.com/office/word/2010/wordprocessingShape" mc:Ignorable="w14 wp14">
   <w:body>
+    <w:p>
+      <w:pPr>
+        <w:pStyle w:val="Heading1"/>
+      </w:pPr>
+      <w:r>
+        <w:t>Question</w:t>
+      </w:r>
+    </w:p>
+    <w:p>
+      <w:r>
+        <w:t>what's the medulla</w:t>
+      </w:r>
+    </w:p>
     <w:p>
       <w:pPr>
         <w:pStyle w:val="Heading1"/>
@@ -12,37 +25,7 @@
     </w:p>
     <w:p>
       <w:r>
-        <w:t xml:space="preserve"> The Edinger-Westphal nucleus is a nucleus in the midbrain that contains preganglionic parasympathetic neurons. These neurons are concerned with reflex responses of the smooth muscles of the eye.</w:t>
-      </w:r>
-    </w:p>
-    <w:p>
-      <w:r>
-        <w:t>1) The Edinger-Westphal nucleus is a nucleus in the midbrain that contains preganglionic parasympathetic neurons. These neurons are concerned with reflex responses of the smooth muscles of the eye.</w:t>
-      </w:r>
-    </w:p>
-    <w:p>
-      <w:r>
-        <w:t>2) The Edinger-Westphal nucleus is a nucleus in the midbrain that contains preganglionic parasympathetic neurons. These neurons are concerned with reflex responses of the smooth muscles of the eye.</w:t>
-      </w:r>
-    </w:p>
-    <w:p>
-      <w:r>
-        <w:t>3) The Edinger-Westphal nucleus is a nucleus in the midbrain that contains preganglionic parasympathetic neurons. These neurons are concerned with reflex responses of the smooth muscles of the eye.</w:t>
-      </w:r>
-    </w:p>
-    <w:p>
-      <w:r>
-        <w:t>4) The Edinger-Westphal nucleus is a nucleus in the midbrain that contains preganglionic parasympathetic neurons. These neurons are concerned with reflex responses of the smooth muscles of the eye.</w:t>
-      </w:r>
-    </w:p>
-    <w:p>
-      <w:r>
-        <w:t>5) The Edinger-Westphal nucleus is a nucleus in the midbrain that contains preganglionic parasympathetic neurons. These neurons are concerned with reflex responses of the smooth muscles of the eye.</w:t>
-      </w:r>
-    </w:p>
-    <w:p>
-      <w:r>
-        <w:t>6) The Edinger-</w:t>
+        <w:t xml:space="preserve"> The medulla, specifically the medulla oblongata, is the caudal portion of the brain stem, which in current usage refers to the medulla oblongata. It is involved in various functions, including the control of breathing, heart rate, and blood pressure. The medulla also contains neurons that receive afferents from the contralateral cerebral cortex and superior colliculus, projecting to all the ocular motor nuclei. Additionally, the term "medulla" can refer to a malignant tumor called medulloblastoma, typically found in young children in the midline of the cerebellum.</w:t>
       </w:r>
     </w:p>
     <w:p>
@@ -55,42 +38,42 @@
     </w:p>
     <w:p>
       <w:r>
-        <w:t>the_human_nervous_system_Charles_R_Noback.pdf | chunk=doc_c129110f_128_01446 | g=128 | pos=1446</w:t>
+        <w:t>barr_human_nervous_system.pdf | chunk=doc_dd0c01e1_128_02220 | g=128 | pos=2220</w:t>
       </w:r>
     </w:p>
     <w:p>
       <w:r>
-        <w:t>barr_human_nervous_system.pdf | chunk=doc_c4cfa25c_128_00624 | g=128 | pos=624</w:t>
+        <w:t>barr_human_nervous_system.pdf | chunk=doc_b693274a_128_00596 | g=128 | pos=596</w:t>
       </w:r>
     </w:p>
     <w:p>
       <w:r>
-        <w:t>barr_human_nervous_system.pdf | chunk=doc_c4cfa25c_128_00653 | g=128 | pos=653</w:t>
+        <w:t>barr_human_nervous_system.pdf | chunk=doc_b693274a_128_02051 | g=128 | pos=2051</w:t>
       </w:r>
     </w:p>
     <w:p>
       <w:r>
-        <w:t>a_textbook_of_neuroanatomy.pdf | chunk=doc_9b859616_128_01495 | g=128 | pos=1495</w:t>
+        <w:t>the_human_nervous_system_Charles_R_Noback.pdf | chunk=doc_99d01612_128_00055 | g=128 | pos=55</w:t>
       </w:r>
     </w:p>
     <w:p>
       <w:r>
-        <w:t>barr_human_nervous_system.pdf | chunk=doc_c4cfa25c_128_00560 | g=128 | pos=560</w:t>
+        <w:t>a_textbook_of_neuroanatomy[1].pdf | chunk=doc_3e1a510d_128_00524 | g=128 | pos=524</w:t>
       </w:r>
     </w:p>
     <w:p>
       <w:r>
-        <w:t>the_human_nervous_system_Charles_R_Noback.pdf | chunk=doc_c129110f_128_01358 | g=128 | pos=1358</w:t>
+        <w:t>barr_human_nervous_system.pdf | chunk=doc_dd0c01e1_128_00433 | g=128 | pos=433</w:t>
       </w:r>
     </w:p>
     <w:p>
       <w:r>
-        <w:t>Carpenter Human-Neuroanatomy_text.pdf | chunk=doc_61847762_128_01638 | g=128 | pos=1638</w:t>
+        <w:t>Carpenter Human-Neuroanatomy_text.pdf | chunk=doc_7de7ebc5_512_00194 | g=512 | pos=194</w:t>
       </w:r>
     </w:p>
     <w:p>
       <w:r>
-        <w:t>barr_human_nervous_system.pdf | chunk=doc_c4cfa25c_512_00191 | g=512 | pos=191</w:t>
+        <w:t>Carpenter Human-Neuroanatomy_text.pdf | chunk=doc_96554193_512_00473 | g=512 | pos=473</w:t>
       </w:r>
     </w:p>
     <w:sectPr>

</xml_diff>

<commit_message>
Export PDF and other documents through Chat with Agent
</commit_message>
<xml_diff>
--- a/exports/qa.docx
+++ b/exports/qa.docx
@@ -12,7 +12,7 @@
     </w:p>
     <w:p>
       <w:r>
-        <w:t>what's the medulla</w:t>
+        <w:t>What is the role of broca's region?</w:t>
       </w:r>
     </w:p>
     <w:p>
@@ -25,7 +25,7 @@
     </w:p>
     <w:p>
       <w:r>
-        <w:t xml:space="preserve"> The medulla, specifically the medulla oblongata, is the caudal portion of the brain stem, which in current usage refers to the medulla oblongata. It is involved in various functions, including the control of breathing, heart rate, and blood pressure. The medulla also contains neurons that receive afferents from the contralateral cerebral cortex and superior colliculus, projecting to all the ocular motor nuclei. Additionally, the term "medulla" can refer to a malignant tumor called medulloblastoma, typically found in young children in the midline of the cerebellum.</w:t>
+        <w:t xml:space="preserve"> Broca's area, located in the inferior frontal gyrus of the dominant hemisphere, is responsible for the production of speech. It plays a crucial role in assembling the motor functions necessary for speech and writing.</w:t>
       </w:r>
     </w:p>
     <w:p>
@@ -38,42 +38,42 @@
     </w:p>
     <w:p>
       <w:r>
-        <w:t>barr_human_nervous_system.pdf | chunk=doc_dd0c01e1_128_02220 | g=128 | pos=2220</w:t>
+        <w:t>Nervous-System.docx | chunk=doc_df79698e_128_00106 | g=128 | pos=106</w:t>
       </w:r>
     </w:p>
     <w:p>
       <w:r>
-        <w:t>barr_human_nervous_system.pdf | chunk=doc_b693274a_128_00596 | g=128 | pos=596</w:t>
+        <w:t>a_textbook_of_neuroanatomy[1].pdf | chunk=doc_aae29cfb_128_00440 | g=128 | pos=440</w:t>
       </w:r>
     </w:p>
     <w:p>
       <w:r>
-        <w:t>barr_human_nervous_system.pdf | chunk=doc_b693274a_128_02051 | g=128 | pos=2051</w:t>
+        <w:t>a_textbook_of_neuroanatomy[1].pdf | chunk=doc_3e1a510d_128_00479 | g=128 | pos=479</w:t>
       </w:r>
     </w:p>
     <w:p>
       <w:r>
-        <w:t>the_human_nervous_system_Charles_R_Noback.pdf | chunk=doc_99d01612_128_00055 | g=128 | pos=55</w:t>
+        <w:t>a_textbook_of_neuroanatomy_leslie.pdf | chunk=doc_b13ae60e_128_00479 | g=128 | pos=479</w:t>
       </w:r>
     </w:p>
     <w:p>
       <w:r>
-        <w:t>a_textbook_of_neuroanatomy[1].pdf | chunk=doc_3e1a510d_128_00524 | g=128 | pos=524</w:t>
+        <w:t>a_textbook_of_neuroanatomy_leslie.pdf | chunk=doc_7f1a71dd_128_00479 | g=128 | pos=479</w:t>
       </w:r>
     </w:p>
     <w:p>
       <w:r>
-        <w:t>barr_human_nervous_system.pdf | chunk=doc_dd0c01e1_128_00433 | g=128 | pos=433</w:t>
+        <w:t>Carpenter Human-Neuroanatomy_text.pdf | chunk=doc_7d9f67ec_2048_00224 | g=2048 | pos=224</w:t>
       </w:r>
     </w:p>
     <w:p>
       <w:r>
-        <w:t>Carpenter Human-Neuroanatomy_text.pdf | chunk=doc_7de7ebc5_512_00194 | g=512 | pos=194</w:t>
+        <w:t>Carpenter Human-Neuroanatomy_text.pdf | chunk=doc_96554193_2048_00224 | g=2048 | pos=224</w:t>
       </w:r>
     </w:p>
     <w:p>
       <w:r>
-        <w:t>Carpenter Human-Neuroanatomy_text.pdf | chunk=doc_96554193_512_00473 | g=512 | pos=473</w:t>
+        <w:t>Carpenter Human-Neuroanatomy_text.pdf | chunk=doc_d6035aed_2048_00224 | g=2048 | pos=224</w:t>
       </w:r>
     </w:p>
     <w:sectPr>

</xml_diff>

<commit_message>
latest quiz exports from demo
</commit_message>
<xml_diff>
--- a/exports/qa.docx
+++ b/exports/qa.docx
@@ -12,7 +12,7 @@
     </w:p>
     <w:p>
       <w:r>
-        <w:t>What is the role of broca's region?</w:t>
+        <w:t>What's Broca's Region?</w:t>
       </w:r>
     </w:p>
     <w:p>
@@ -25,7 +25,7 @@
     </w:p>
     <w:p>
       <w:r>
-        <w:t xml:space="preserve"> Broca's area, located in the inferior frontal gyrus of the dominant hemisphere, is responsible for the production of speech. It plays a crucial role in assembling the motor functions necessary for speech and writing.</w:t>
+        <w:t xml:space="preserve"> Broca's area is located just in front of the voice control area of the left motor cortex, known for assembling the motor functions of speech and writing. It is associated with speech production and is situated near the olfactory sulcus, which is partly occupied by the olfactory bulb and tract.</w:t>
       </w:r>
     </w:p>
     <w:p>
@@ -38,27 +38,17 @@
     </w:p>
     <w:p>
       <w:r>
+        <w:t>a_textbook_of_neuroanatomy[1].pdf | chunk=doc_aae29cfb_128_00440 | g=128 | pos=440</w:t>
+      </w:r>
+    </w:p>
+    <w:p>
+      <w:r>
         <w:t>Nervous-System.docx | chunk=doc_df79698e_128_00106 | g=128 | pos=106</w:t>
       </w:r>
     </w:p>
     <w:p>
       <w:r>
-        <w:t>a_textbook_of_neuroanatomy[1].pdf | chunk=doc_aae29cfb_128_00440 | g=128 | pos=440</w:t>
-      </w:r>
-    </w:p>
-    <w:p>
-      <w:r>
-        <w:t>a_textbook_of_neuroanatomy[1].pdf | chunk=doc_3e1a510d_128_00479 | g=128 | pos=479</w:t>
-      </w:r>
-    </w:p>
-    <w:p>
-      <w:r>
-        <w:t>a_textbook_of_neuroanatomy_leslie.pdf | chunk=doc_b13ae60e_128_00479 | g=128 | pos=479</w:t>
-      </w:r>
-    </w:p>
-    <w:p>
-      <w:r>
-        <w:t>a_textbook_of_neuroanatomy_leslie.pdf | chunk=doc_7f1a71dd_128_00479 | g=128 | pos=479</w:t>
+        <w:t>Nervous-System.docx | chunk=doc_8dd56517_128_00106 | g=128 | pos=106</w:t>
       </w:r>
     </w:p>
     <w:p>
@@ -74,6 +64,16 @@
     <w:p>
       <w:r>
         <w:t>Carpenter Human-Neuroanatomy_text.pdf | chunk=doc_d6035aed_2048_00224 | g=2048 | pos=224</w:t>
+      </w:r>
+    </w:p>
+    <w:p>
+      <w:r>
+        <w:t>Carpenter Human-Neuroanatomy_text.pdf | chunk=doc_cb574acd_2048_00224 | g=2048 | pos=224</w:t>
+      </w:r>
+    </w:p>
+    <w:p>
+      <w:r>
+        <w:t>Carpenter Human-Neuroanatomy_text.pdf | chunk=doc_7278b931_2048_00224 | g=2048 | pos=224</w:t>
       </w:r>
     </w:p>
     <w:sectPr>

</xml_diff>